<commit_message>
fix(inventario): plantilla bitácora sin datos de colaborador
La plantilla traía la fila de ejemplo de Luis Fernando (equipo, serie y
precio) y su nombre en los metadatos del documento. Se vació esa fila y se
limpiaron dc:creator y cp:lastModifiedBy; quedan 12 filas en blanco. Se editó
el .docx en lugar de rehacerlo para conservar el logo, los anchos de columna
y los estilos corporativos.

Co-Authored-By: Claude Opus 5 (1M context) <noreply@anthropic.com>
</commit_message>
<xml_diff>
--- a/apps/api/src/modules/inventory/templates/bitacora-asignacion.docx
+++ b/apps/api/src/modules/inventory/templates/bitacora-asignacion.docx
@@ -471,13 +471,6 @@
                 <w:color w:val="000000" w:themeColor="text1"/>
               </w:rPr>
             </w:pPr>
-            <w:r>
-              <w:rPr>
-                <w:rFonts w:ascii="Aptos Narrow" w:eastAsia="Aptos Narrow" w:hAnsi="Aptos Narrow" w:cs="Aptos Narrow"/>
-                <w:color w:val="000000" w:themeColor="text1"/>
-              </w:rPr>
-              <w:t>X</w:t>
-            </w:r>
           </w:p>
         </w:tc>
         <w:tc>
@@ -514,13 +507,6 @@
                 <w:color w:val="000000" w:themeColor="text1"/>
               </w:rPr>
             </w:pPr>
-            <w:r>
-              <w:rPr>
-                <w:rFonts w:ascii="Aptos Narrow" w:eastAsia="Aptos Narrow" w:hAnsi="Aptos Narrow" w:cs="Aptos Narrow"/>
-                <w:color w:val="000000" w:themeColor="text1"/>
-              </w:rPr>
-              <w:t>MA064</w:t>
-            </w:r>
           </w:p>
         </w:tc>
         <w:tc>
@@ -539,13 +525,6 @@
                 <w:color w:val="000000" w:themeColor="text1"/>
               </w:rPr>
             </w:pPr>
-            <w:r>
-              <w:rPr>
-                <w:rFonts w:ascii="Aptos Narrow" w:eastAsia="Aptos Narrow" w:hAnsi="Aptos Narrow" w:cs="Aptos Narrow"/>
-                <w:color w:val="000000" w:themeColor="text1"/>
-              </w:rPr>
-              <w:t>LAPTOP</w:t>
-            </w:r>
           </w:p>
         </w:tc>
         <w:tc>
@@ -564,13 +543,6 @@
                 <w:color w:val="000000" w:themeColor="text1"/>
               </w:rPr>
             </w:pPr>
-            <w:r>
-              <w:rPr>
-                <w:rFonts w:ascii="Aptos Narrow" w:eastAsia="Aptos Narrow" w:hAnsi="Aptos Narrow" w:cs="Aptos Narrow"/>
-                <w:color w:val="000000" w:themeColor="text1"/>
-              </w:rPr>
-              <w:t>ASUS EXPERTBOOK</w:t>
-            </w:r>
           </w:p>
         </w:tc>
         <w:tc>
@@ -589,13 +561,6 @@
                 <w:color w:val="000000" w:themeColor="text1"/>
               </w:rPr>
             </w:pPr>
-            <w:r>
-              <w:rPr>
-                <w:rFonts w:ascii="Aptos Narrow" w:eastAsia="Aptos Narrow" w:hAnsi="Aptos Narrow" w:cs="Aptos Narrow"/>
-                <w:color w:val="000000" w:themeColor="text1"/>
-              </w:rPr>
-              <w:t>T6NXCV14Y211257</w:t>
-            </w:r>
           </w:p>
         </w:tc>
         <w:tc>
@@ -614,13 +579,6 @@
                 <w:color w:val="000000" w:themeColor="text1"/>
               </w:rPr>
             </w:pPr>
-            <w:r>
-              <w:rPr>
-                <w:rFonts w:ascii="Aptos Narrow" w:eastAsia="Aptos Narrow" w:hAnsi="Aptos Narrow" w:cs="Aptos Narrow"/>
-                <w:color w:val="000000" w:themeColor="text1"/>
-              </w:rPr>
-              <w:t>Win 11 Pro</w:t>
-            </w:r>
           </w:p>
         </w:tc>
         <w:tc>
@@ -639,13 +597,6 @@
                 <w:color w:val="000000" w:themeColor="text1"/>
               </w:rPr>
             </w:pPr>
-            <w:r>
-              <w:rPr>
-                <w:rFonts w:ascii="Aptos Narrow" w:eastAsia="Aptos Narrow" w:hAnsi="Aptos Narrow" w:cs="Aptos Narrow"/>
-                <w:color w:val="000000" w:themeColor="text1"/>
-              </w:rPr>
-              <w:t>$18,800.00</w:t>
-            </w:r>
           </w:p>
         </w:tc>
         <w:tc>
@@ -664,20 +615,6 @@
                 <w:color w:val="000000" w:themeColor="text1"/>
               </w:rPr>
             </w:pPr>
-            <w:r>
-              <w:rPr>
-                <w:rFonts w:ascii="Aptos Narrow" w:eastAsia="Aptos Narrow" w:hAnsi="Aptos Narrow" w:cs="Aptos Narrow"/>
-                <w:color w:val="000000" w:themeColor="text1"/>
-              </w:rPr>
-              <w:t>13/</w:t>
-            </w:r>
-            <w:r>
-              <w:rPr>
-                <w:rFonts w:ascii="Aptos Narrow" w:eastAsia="Aptos Narrow" w:hAnsi="Aptos Narrow" w:cs="Aptos Narrow"/>
-                <w:color w:val="000000" w:themeColor="text1"/>
-              </w:rPr>
-              <w:t>abr/2026</w:t>
-            </w:r>
           </w:p>
         </w:tc>
         <w:tc>

</xml_diff>